<commit_message>
docs: add Celebration Self-Injury (+15) manual rule
</commit_message>
<xml_diff>
--- a/LEAGUE_RULES.docx
+++ b/LEAGUE_RULES.docx
@@ -1314,6 +1314,49 @@
             </w:r>
             <w:r>
               <w:t xml:space="preserve">due to a meltdown.</w:t>
+            </w:r>
+          </w:p>
+        </w:tc>
+      </w:tr>
+      <w:tr>
+        <w:tc>
+          <w:tcPr/>
+          <w:p>
+            <w:pPr>
+              <w:pStyle w:val="Compact"/>
+            </w:pPr>
+            <w:r>
+              <w:rPr>
+                <w:b/>
+                <w:bCs/>
+              </w:rPr>
+              <w:t xml:space="preserve">Celebration Self-Injury</w:t>
+            </w:r>
+          </w:p>
+        </w:tc>
+        <w:tc>
+          <w:tcPr/>
+          <w:p>
+            <w:pPr>
+              <w:pStyle w:val="Compact"/>
+            </w:pPr>
+            <w:r>
+              <w:rPr>
+                <w:b/>
+                <w:bCs/>
+              </w:rPr>
+              <w:t xml:space="preserve">+15</w:t>
+            </w:r>
+          </w:p>
+        </w:tc>
+        <w:tc>
+          <w:tcPr/>
+          <w:p>
+            <w:pPr>
+              <w:pStyle w:val="Compact"/>
+            </w:pPr>
+            <w:r>
+              <w:t xml:space="preserve">Your player injures himself while celebrating.</w:t>
             </w:r>
           </w:p>
         </w:tc>

</xml_diff>

<commit_message>
docs: remove payout structure (incorrect)
</commit_message>
<xml_diff>
--- a/LEAGUE_RULES.docx
+++ b/LEAGUE_RULES.docx
@@ -2,7 +2,7 @@
 <file path=word/document.xml><?xml version="1.0" encoding="utf-8"?>
 <w:document xmlns:w="http://schemas.openxmlformats.org/wordprocessingml/2006/main" xmlns:m="http://schemas.openxmlformats.org/officeDocument/2006/math" xmlns:r="http://schemas.openxmlformats.org/officeDocument/2006/relationships" xmlns:o="urn:schemas-microsoft-com:office:office" xmlns:v="urn:schemas-microsoft-com:vml" xmlns:w10="urn:schemas-microsoft-com:office:word" xmlns:a="http://schemas.openxmlformats.org/drawingml/2006/main" xmlns:pic="http://schemas.openxmlformats.org/drawingml/2006/picture" xmlns:wp="http://schemas.openxmlformats.org/drawingml/2006/wordprocessingDrawing">
   <w:body>
-    <w:bookmarkStart w:id="31" w:name="fire-league-of-chaos--official-rules"/>
+    <w:bookmarkStart w:id="30" w:name="fire-league-of-chaos--official-rules"/>
     <w:p>
       <w:pPr>
         <w:pStyle w:val="Heading1"/>
@@ -277,7 +277,7 @@
         <w:t xml:space="preserve"> </w:t>
       </w:r>
       <w:r>
-        <w:t xml:space="preserve">corrections can move things — that's why payouts wait until the season is done.</w:t>
+        <w:t xml:space="preserve">corrections from the NFL can also move things after the fact.</w:t>
       </w:r>
     </w:p>
     <w:p>
@@ -1807,13 +1807,13 @@
     </w:p>
     <w:bookmarkEnd w:id="18"/>
     <w:bookmarkEnd w:id="19"/>
-    <w:bookmarkStart w:id="20" w:name="moneybag-payouts-160-pot"/>
+    <w:bookmarkStart w:id="20" w:name="tldr"/>
     <w:p>
       <w:pPr>
         <w:pStyle w:val="Heading2"/>
       </w:pPr>
       <w:r>
-        <w:t xml:space="preserve">💰 Payouts ($160 pot)</w:t>
+        <w:t xml:space="preserve">TL;DR</w:t>
       </w:r>
     </w:p>
     <w:p>
@@ -1829,13 +1829,13 @@
           <w:b/>
           <w:bCs/>
         </w:rPr>
-        <w:t xml:space="preserve">1st place:</w:t>
-      </w:r>
-      <w:r>
-        <w:t xml:space="preserve"> </w:t>
-      </w:r>
-      <w:r>
-        <w:t xml:space="preserve">$75</w:t>
+        <w:t xml:space="preserve">Automatic every Wednesday:</w:t>
+      </w:r>
+      <w:r>
+        <w:t xml:space="preserve"> </w:t>
+      </w:r>
+      <w:r>
+        <w:t xml:space="preserve">offensive tackles (+15), drops (+5), red-zone turnovers (+5 to everyone involved), invalid spots (−15, injuries auto-exempt).</w:t>
       </w:r>
     </w:p>
     <w:p>
@@ -1851,13 +1851,13 @@
           <w:b/>
           <w:bCs/>
         </w:rPr>
-        <w:t xml:space="preserve">Weekly high score (Weeks 1–17):</w:t>
-      </w:r>
-      <w:r>
-        <w:t xml:space="preserve"> </w:t>
-      </w:r>
-      <w:r>
-        <w:t xml:space="preserve">$5 each</w:t>
+        <w:t xml:space="preserve">Script flags, you confirm:</w:t>
+      </w:r>
+      <w:r>
+        <w:t xml:space="preserve"> </w:t>
+      </w:r>
+      <w:r>
+        <w:t xml:space="preserve">ejections (+20), goal-line celebration fumbles (+35).</w:t>
       </w:r>
     </w:p>
     <w:p>
@@ -1869,23 +1869,17 @@
         </w:numPr>
       </w:pPr>
       <w:r>
-        <w:t xml:space="preserve">Highest-scoring week</w:t>
-      </w:r>
-      <w:r>
-        <w:t xml:space="preserve"> </w:t>
-      </w:r>
-      <w:r>
         <w:rPr>
           <w:b/>
           <w:bCs/>
         </w:rPr>
-        <w:t xml:space="preserve">applies in the playoffs</w:t>
-      </w:r>
-      <w:r>
-        <w:t xml:space="preserve"> </w:t>
-      </w:r>
-      <w:r>
-        <w:t xml:space="preserve">too.</w:t>
+        <w:t xml:space="preserve">You report:</w:t>
+      </w:r>
+      <w:r>
+        <w:t xml:space="preserve"> </w:t>
+      </w:r>
+      <w:r>
+        <w:t xml:space="preserve">arrests, suspensions, cuts, gambling (Pete Rose), voluntary meltdowns (Antonio Brown), benchings (+20), and chaotic-event votes.</w:t>
       </w:r>
     </w:p>
     <w:p>
@@ -1901,10 +1895,13 @@
           <w:b/>
           <w:bCs/>
         </w:rPr>
-        <w:t xml:space="preserve">Payouts are made the Wednesday after the championship</w:t>
-      </w:r>
-      <w:r>
-        <w:t xml:space="preserve">, to account for stat corrections.</w:t>
+        <w:t xml:space="preserve">Ping the commissioner</w:t>
+      </w:r>
+      <w:r>
+        <w:t xml:space="preserve"> </w:t>
+      </w:r>
+      <w:r>
+        <w:t xml:space="preserve">for anything manual. Records update if outcomes change. Chaos! 🔥</w:t>
       </w:r>
     </w:p>
     <w:p>
@@ -1915,13 +1912,169 @@
       </w:r>
     </w:p>
     <w:bookmarkEnd w:id="20"/>
-    <w:bookmarkStart w:id="21" w:name="tldr"/>
+    <w:bookmarkStart w:id="29" w:name="X5b931a030f6b61b1a7efa86467065f192acdeb3"/>
     <w:p>
       <w:pPr>
         <w:pStyle w:val="Heading2"/>
       </w:pPr>
       <w:r>
-        <w:t xml:space="preserve">TL;DR</w:t>
+        <w:t xml:space="preserve">Appendix — How the Automation Works (Commissioner Only)</w:t>
+      </w:r>
+    </w:p>
+    <w:p>
+      <w:pPr>
+        <w:pStyle w:val="FirstParagraph"/>
+      </w:pPr>
+      <w:r>
+        <w:t xml:space="preserve">The weekly Chaos adjustments come from</w:t>
+      </w:r>
+      <w:r>
+        <w:t xml:space="preserve"> </w:t>
+      </w:r>
+      <w:r>
+        <w:rPr>
+          <w:rStyle w:val="VerbatimChar"/>
+        </w:rPr>
+        <w:t xml:space="preserve">chaos.py</w:t>
+      </w:r>
+      <w:r>
+        <w:t xml:space="preserve">, which pulls fantasy starters</w:t>
+      </w:r>
+      <w:r>
+        <w:t xml:space="preserve"> </w:t>
+      </w:r>
+      <w:r>
+        <w:t xml:space="preserve">from Sleeper and joins them against nflverse NFL data (play-by-play, FTN drop</w:t>
+      </w:r>
+      <w:r>
+        <w:t xml:space="preserve"> </w:t>
+      </w:r>
+      <w:r>
+        <w:t xml:space="preserve">charting, snap counts, and the injury report).</w:t>
+      </w:r>
+    </w:p>
+    <w:bookmarkStart w:id="21" w:name="one-time-setup"/>
+    <w:p>
+      <w:pPr>
+        <w:pStyle w:val="Heading3"/>
+      </w:pPr>
+      <w:r>
+        <w:t xml:space="preserve">One-time setup</w:t>
+      </w:r>
+    </w:p>
+    <w:p>
+      <w:pPr>
+        <w:pStyle w:val="SourceCode"/>
+      </w:pPr>
+      <w:r>
+        <w:rPr>
+          <w:rStyle w:val="ExtensionTok"/>
+        </w:rPr>
+        <w:t xml:space="preserve">./install.sh</w:t>
+      </w:r>
+    </w:p>
+    <w:p>
+      <w:pPr>
+        <w:pStyle w:val="FirstParagraph"/>
+      </w:pPr>
+      <w:r>
+        <w:t xml:space="preserve">Creates a</w:t>
+      </w:r>
+      <w:r>
+        <w:t xml:space="preserve"> </w:t>
+      </w:r>
+      <w:r>
+        <w:rPr>
+          <w:rStyle w:val="VerbatimChar"/>
+        </w:rPr>
+        <w:t xml:space="preserve">.venv</w:t>
+      </w:r>
+      <w:r>
+        <w:t xml:space="preserve"> </w:t>
+      </w:r>
+      <w:r>
+        <w:t xml:space="preserve">and installs pinned dependencies. (</w:t>
+      </w:r>
+      <w:r>
+        <w:rPr>
+          <w:rStyle w:val="VerbatimChar"/>
+        </w:rPr>
+        <w:t xml:space="preserve">nfl_data_py</w:t>
+      </w:r>
+      <w:r>
+        <w:t xml:space="preserve"> </w:t>
+      </w:r>
+      <w:r>
+        <w:t xml:space="preserve">over-pins</w:t>
+      </w:r>
+      <w:r>
+        <w:t xml:space="preserve"> </w:t>
+      </w:r>
+      <w:r>
+        <w:t xml:space="preserve">pandas/numpy, so the installer handles that; see</w:t>
+      </w:r>
+      <w:r>
+        <w:t xml:space="preserve"> </w:t>
+      </w:r>
+      <w:r>
+        <w:rPr>
+          <w:rStyle w:val="VerbatimChar"/>
+        </w:rPr>
+        <w:t xml:space="preserve">requirements.txt</w:t>
+      </w:r>
+      <w:r>
+        <w:t xml:space="preserve">.)</w:t>
+      </w:r>
+    </w:p>
+    <w:bookmarkEnd w:id="21"/>
+    <w:bookmarkStart w:id="22" w:name="weekly-run-each-wednesday"/>
+    <w:p>
+      <w:pPr>
+        <w:pStyle w:val="Heading3"/>
+      </w:pPr>
+      <w:r>
+        <w:t xml:space="preserve">Weekly run (each Wednesday)</w:t>
+      </w:r>
+    </w:p>
+    <w:p>
+      <w:pPr>
+        <w:pStyle w:val="SourceCode"/>
+      </w:pPr>
+      <w:r>
+        <w:rPr>
+          <w:rStyle w:val="ExtensionTok"/>
+        </w:rPr>
+        <w:t xml:space="preserve">.venv/bin/python</w:t>
+      </w:r>
+      <w:r>
+        <w:rPr>
+          <w:rStyle w:val="NormalTok"/>
+        </w:rPr>
+        <w:t xml:space="preserve"> chaos.py </w:t>
+      </w:r>
+      <w:r>
+        <w:rPr>
+          <w:rStyle w:val="AttributeTok"/>
+        </w:rPr>
+        <w:t xml:space="preserve">--season</w:t>
+      </w:r>
+      <w:r>
+        <w:rPr>
+          <w:rStyle w:val="NormalTok"/>
+        </w:rPr>
+        <w:t xml:space="preserve"> 2025 </w:t>
+      </w:r>
+      <w:r>
+        <w:rPr>
+          <w:rStyle w:val="AttributeTok"/>
+        </w:rPr>
+        <w:t xml:space="preserve">--week</w:t>
+      </w:r>
+      <w:r>
+        <w:rPr>
+          <w:rStyle w:val="NormalTok"/>
+        </w:rPr>
+        <w:t xml:space="preserve"> 2</w:t>
       </w:r>
     </w:p>
     <w:p>
@@ -1933,17 +2086,7 @@
         </w:numPr>
       </w:pPr>
       <w:r>
-        <w:rPr>
-          <w:b/>
-          <w:bCs/>
-        </w:rPr>
-        <w:t xml:space="preserve">Automatic every Wednesday:</w:t>
-      </w:r>
-      <w:r>
-        <w:t xml:space="preserve"> </w:t>
-      </w:r>
-      <w:r>
-        <w:t xml:space="preserve">offensive tackles (+15), drops (+5), red-zone turnovers (+5 to everyone involved), invalid spots (−15, injuries auto-exempt).</w:t>
+        <w:t xml:space="preserve">Auto-selects the correct season's Sleeper league (walks the league history).</w:t>
       </w:r>
     </w:p>
     <w:p>
@@ -1959,13 +2102,19 @@
           <w:b/>
           <w:bCs/>
         </w:rPr>
-        <w:t xml:space="preserve">Script flags, you confirm:</w:t>
-      </w:r>
-      <w:r>
-        <w:t xml:space="preserve"> </w:t>
-      </w:r>
-      <w:r>
-        <w:t xml:space="preserve">ejections (+20), goal-line celebration fumbles (+35).</w:t>
+        <w:t xml:space="preserve">Refuses to run if any game in the week isn't fully charted yet</w:t>
+      </w:r>
+      <w:r>
+        <w:t xml:space="preserve"> </w:t>
+      </w:r>
+      <w:r>
+        <w:t xml:space="preserve">— this is</w:t>
+      </w:r>
+      <w:r>
+        <w:t xml:space="preserve"> </w:t>
+      </w:r>
+      <w:r>
+        <w:t xml:space="preserve">why results wait until Wednesday. Re-run once all games are charted.</w:t>
       </w:r>
     </w:p>
     <w:p>
@@ -1977,274 +2126,17 @@
         </w:numPr>
       </w:pPr>
       <w:r>
-        <w:rPr>
-          <w:b/>
-          <w:bCs/>
-        </w:rPr>
-        <w:t xml:space="preserve">You report:</w:t>
-      </w:r>
-      <w:r>
-        <w:t xml:space="preserve"> </w:t>
-      </w:r>
-      <w:r>
-        <w:t xml:space="preserve">arrests, suspensions, cuts, gambling (Pete Rose), voluntary meltdowns (Antonio Brown), benchings (+20), and chaotic-event votes.</w:t>
-      </w:r>
-    </w:p>
-    <w:p>
-      <w:pPr>
-        <w:pStyle w:val="Compact"/>
-        <w:numPr>
-          <w:ilvl w:val="0"/>
-          <w:numId w:val="1006"/>
-        </w:numPr>
-      </w:pPr>
-      <w:r>
-        <w:rPr>
-          <w:b/>
-          <w:bCs/>
-        </w:rPr>
-        <w:t xml:space="preserve">Ping the commissioner</w:t>
-      </w:r>
-      <w:r>
-        <w:t xml:space="preserve"> </w:t>
-      </w:r>
-      <w:r>
-        <w:t xml:space="preserve">for anything manual. Records update if outcomes change. Chaos! 🔥</w:t>
-      </w:r>
-    </w:p>
-    <w:p>
-      <w:r>
-        <w:pict>
-          <v:rect style="width:0;height:1.5pt" o:hralign="center" o:hrstd="t" o:hr="t"/>
-        </w:pict>
-      </w:r>
-    </w:p>
-    <w:bookmarkEnd w:id="21"/>
-    <w:bookmarkStart w:id="30" w:name="X5b931a030f6b61b1a7efa86467065f192acdeb3"/>
-    <w:p>
-      <w:pPr>
-        <w:pStyle w:val="Heading2"/>
-      </w:pPr>
-      <w:r>
-        <w:t xml:space="preserve">Appendix — How the Automation Works (Commissioner Only)</w:t>
-      </w:r>
-    </w:p>
-    <w:p>
-      <w:pPr>
-        <w:pStyle w:val="FirstParagraph"/>
-      </w:pPr>
-      <w:r>
-        <w:t xml:space="preserve">The weekly Chaos adjustments come from</w:t>
-      </w:r>
-      <w:r>
-        <w:t xml:space="preserve"> </w:t>
-      </w:r>
-      <w:r>
-        <w:rPr>
-          <w:rStyle w:val="VerbatimChar"/>
-        </w:rPr>
-        <w:t xml:space="preserve">chaos.py</w:t>
-      </w:r>
-      <w:r>
-        <w:t xml:space="preserve">, which pulls fantasy starters</w:t>
-      </w:r>
-      <w:r>
-        <w:t xml:space="preserve"> </w:t>
-      </w:r>
-      <w:r>
-        <w:t xml:space="preserve">from Sleeper and joins them against nflverse NFL data (play-by-play, FTN drop</w:t>
-      </w:r>
-      <w:r>
-        <w:t xml:space="preserve"> </w:t>
-      </w:r>
-      <w:r>
-        <w:t xml:space="preserve">charting, snap counts, and the injury report).</w:t>
-      </w:r>
-    </w:p>
-    <w:bookmarkStart w:id="22" w:name="one-time-setup"/>
-    <w:p>
-      <w:pPr>
-        <w:pStyle w:val="Heading3"/>
-      </w:pPr>
-      <w:r>
-        <w:t xml:space="preserve">One-time setup</w:t>
-      </w:r>
-    </w:p>
-    <w:p>
-      <w:pPr>
-        <w:pStyle w:val="SourceCode"/>
-      </w:pPr>
-      <w:r>
-        <w:rPr>
-          <w:rStyle w:val="ExtensionTok"/>
-        </w:rPr>
-        <w:t xml:space="preserve">./install.sh</w:t>
-      </w:r>
-    </w:p>
-    <w:p>
-      <w:pPr>
-        <w:pStyle w:val="FirstParagraph"/>
-      </w:pPr>
-      <w:r>
-        <w:t xml:space="preserve">Creates a</w:t>
-      </w:r>
-      <w:r>
-        <w:t xml:space="preserve"> </w:t>
-      </w:r>
-      <w:r>
-        <w:rPr>
-          <w:rStyle w:val="VerbatimChar"/>
-        </w:rPr>
-        <w:t xml:space="preserve">.venv</w:t>
-      </w:r>
-      <w:r>
-        <w:t xml:space="preserve"> </w:t>
-      </w:r>
-      <w:r>
-        <w:t xml:space="preserve">and installs pinned dependencies. (</w:t>
-      </w:r>
-      <w:r>
-        <w:rPr>
-          <w:rStyle w:val="VerbatimChar"/>
-        </w:rPr>
-        <w:t xml:space="preserve">nfl_data_py</w:t>
-      </w:r>
-      <w:r>
-        <w:t xml:space="preserve"> </w:t>
-      </w:r>
-      <w:r>
-        <w:t xml:space="preserve">over-pins</w:t>
-      </w:r>
-      <w:r>
-        <w:t xml:space="preserve"> </w:t>
-      </w:r>
-      <w:r>
-        <w:t xml:space="preserve">pandas/numpy, so the installer handles that; see</w:t>
-      </w:r>
-      <w:r>
-        <w:t xml:space="preserve"> </w:t>
-      </w:r>
-      <w:r>
-        <w:rPr>
-          <w:rStyle w:val="VerbatimChar"/>
-        </w:rPr>
-        <w:t xml:space="preserve">requirements.txt</w:t>
-      </w:r>
-      <w:r>
-        <w:t xml:space="preserve">.)</w:t>
+        <w:t xml:space="preserve">Prints per-player evidence (the actual play descriptions) plus a</w:t>
+      </w:r>
+      <w:r>
+        <w:t xml:space="preserve"> </w:t>
+      </w:r>
+      <w:r>
+        <w:t xml:space="preserve">commissioner-ready adjustment total per team.</w:t>
       </w:r>
     </w:p>
     <w:bookmarkEnd w:id="22"/>
-    <w:bookmarkStart w:id="23" w:name="weekly-run-each-wednesday"/>
-    <w:p>
-      <w:pPr>
-        <w:pStyle w:val="Heading3"/>
-      </w:pPr>
-      <w:r>
-        <w:t xml:space="preserve">Weekly run (each Wednesday)</w:t>
-      </w:r>
-    </w:p>
-    <w:p>
-      <w:pPr>
-        <w:pStyle w:val="SourceCode"/>
-      </w:pPr>
-      <w:r>
-        <w:rPr>
-          <w:rStyle w:val="ExtensionTok"/>
-        </w:rPr>
-        <w:t xml:space="preserve">.venv/bin/python</w:t>
-      </w:r>
-      <w:r>
-        <w:rPr>
-          <w:rStyle w:val="NormalTok"/>
-        </w:rPr>
-        <w:t xml:space="preserve"> chaos.py </w:t>
-      </w:r>
-      <w:r>
-        <w:rPr>
-          <w:rStyle w:val="AttributeTok"/>
-        </w:rPr>
-        <w:t xml:space="preserve">--season</w:t>
-      </w:r>
-      <w:r>
-        <w:rPr>
-          <w:rStyle w:val="NormalTok"/>
-        </w:rPr>
-        <w:t xml:space="preserve"> 2025 </w:t>
-      </w:r>
-      <w:r>
-        <w:rPr>
-          <w:rStyle w:val="AttributeTok"/>
-        </w:rPr>
-        <w:t xml:space="preserve">--week</w:t>
-      </w:r>
-      <w:r>
-        <w:rPr>
-          <w:rStyle w:val="NormalTok"/>
-        </w:rPr>
-        <w:t xml:space="preserve"> 2</w:t>
-      </w:r>
-    </w:p>
-    <w:p>
-      <w:pPr>
-        <w:pStyle w:val="Compact"/>
-        <w:numPr>
-          <w:ilvl w:val="0"/>
-          <w:numId w:val="1007"/>
-        </w:numPr>
-      </w:pPr>
-      <w:r>
-        <w:t xml:space="preserve">Auto-selects the correct season's Sleeper league (walks the league history).</w:t>
-      </w:r>
-    </w:p>
-    <w:p>
-      <w:pPr>
-        <w:pStyle w:val="Compact"/>
-        <w:numPr>
-          <w:ilvl w:val="0"/>
-          <w:numId w:val="1007"/>
-        </w:numPr>
-      </w:pPr>
-      <w:r>
-        <w:rPr>
-          <w:b/>
-          <w:bCs/>
-        </w:rPr>
-        <w:t xml:space="preserve">Refuses to run if any game in the week isn't fully charted yet</w:t>
-      </w:r>
-      <w:r>
-        <w:t xml:space="preserve"> </w:t>
-      </w:r>
-      <w:r>
-        <w:t xml:space="preserve">— this is</w:t>
-      </w:r>
-      <w:r>
-        <w:t xml:space="preserve"> </w:t>
-      </w:r>
-      <w:r>
-        <w:t xml:space="preserve">why results wait until Wednesday. Re-run once all games are charted.</w:t>
-      </w:r>
-    </w:p>
-    <w:p>
-      <w:pPr>
-        <w:pStyle w:val="Compact"/>
-        <w:numPr>
-          <w:ilvl w:val="0"/>
-          <w:numId w:val="1007"/>
-        </w:numPr>
-      </w:pPr>
-      <w:r>
-        <w:t xml:space="preserve">Prints per-player evidence (the actual play descriptions) plus a</w:t>
-      </w:r>
-      <w:r>
-        <w:t xml:space="preserve"> </w:t>
-      </w:r>
-      <w:r>
-        <w:t xml:space="preserve">commissioner-ready adjustment total per team.</w:t>
-      </w:r>
-    </w:p>
-    <w:bookmarkEnd w:id="23"/>
-    <w:bookmarkStart w:id="24" w:name="options"/>
+    <w:bookmarkStart w:id="23" w:name="options"/>
     <w:p>
       <w:pPr>
         <w:pStyle w:val="Heading3"/>
@@ -2399,14 +2291,129 @@
         </w:tc>
       </w:tr>
     </w:tbl>
+    <w:bookmarkEnd w:id="23"/>
+    <w:bookmarkStart w:id="24" w:name="what-is-and-isnt-automated"/>
+    <w:p>
+      <w:pPr>
+        <w:pStyle w:val="Heading3"/>
+      </w:pPr>
+      <w:r>
+        <w:t xml:space="preserve">What is and isn't automated</w:t>
+      </w:r>
+    </w:p>
+    <w:p>
+      <w:pPr>
+        <w:pStyle w:val="Compact"/>
+        <w:numPr>
+          <w:ilvl w:val="0"/>
+          <w:numId w:val="1007"/>
+        </w:numPr>
+      </w:pPr>
+      <w:r>
+        <w:rPr>
+          <w:b/>
+          <w:bCs/>
+        </w:rPr>
+        <w:t xml:space="preserve">Scored automatically:</w:t>
+      </w:r>
+      <w:r>
+        <w:t xml:space="preserve"> </w:t>
+      </w:r>
+      <w:r>
+        <w:t xml:space="preserve">offensive tackles, drops, red-zone turnovers, and</w:t>
+      </w:r>
+      <w:r>
+        <w:t xml:space="preserve"> </w:t>
+      </w:r>
+      <w:r>
+        <w:t xml:space="preserve">invalid roster spots (with injury auto-exemption).</w:t>
+      </w:r>
+    </w:p>
+    <w:p>
+      <w:pPr>
+        <w:pStyle w:val="Compact"/>
+        <w:numPr>
+          <w:ilvl w:val="0"/>
+          <w:numId w:val="1007"/>
+        </w:numPr>
+      </w:pPr>
+      <w:r>
+        <w:rPr>
+          <w:b/>
+          <w:bCs/>
+        </w:rPr>
+        <w:t xml:space="preserve">Flagged for review:</w:t>
+      </w:r>
+      <w:r>
+        <w:t xml:space="preserve"> </w:t>
+      </w:r>
+      <w:r>
+        <w:t xml:space="preserve">ejections, premature goal-line fumbles.</w:t>
+      </w:r>
+    </w:p>
+    <w:p>
+      <w:pPr>
+        <w:pStyle w:val="Compact"/>
+        <w:numPr>
+          <w:ilvl w:val="0"/>
+          <w:numId w:val="1007"/>
+        </w:numPr>
+      </w:pPr>
+      <w:r>
+        <w:rPr>
+          <w:b/>
+          <w:bCs/>
+        </w:rPr>
+        <w:t xml:space="preserve">Entirely manual:</w:t>
+      </w:r>
+      <w:r>
+        <w:t xml:space="preserve"> </w:t>
+      </w:r>
+      <w:r>
+        <w:t xml:space="preserve">arrests, league suspensions, cuts, the Pete Rose Award,</w:t>
+      </w:r>
+      <w:r>
+        <w:t xml:space="preserve"> </w:t>
+      </w:r>
+      <w:r>
+        <w:t xml:space="preserve">the Antonio Brown Rule, benchings, and chaotic-event votes — these require</w:t>
+      </w:r>
+      <w:r>
+        <w:t xml:space="preserve"> </w:t>
+      </w:r>
+      <w:r>
+        <w:t xml:space="preserve">news or judgment the data can't provide.</w:t>
+      </w:r>
+    </w:p>
     <w:bookmarkEnd w:id="24"/>
-    <w:bookmarkStart w:id="25" w:name="what-is-and-isnt-automated"/>
+    <w:bookmarkStart w:id="28" w:name="data-sources--attribution"/>
     <w:p>
       <w:pPr>
         <w:pStyle w:val="Heading3"/>
       </w:pPr>
       <w:r>
-        <w:t xml:space="preserve">What is and isn't automated</w:t>
+        <w:t xml:space="preserve">Data sources &amp; attribution</w:t>
+      </w:r>
+    </w:p>
+    <w:p>
+      <w:pPr>
+        <w:pStyle w:val="FirstParagraph"/>
+      </w:pPr>
+      <w:r>
+        <w:t xml:space="preserve">All automated stats come from</w:t>
+      </w:r>
+      <w:r>
+        <w:t xml:space="preserve"> </w:t>
+      </w:r>
+      <w:r>
+        <w:rPr>
+          <w:b/>
+          <w:bCs/>
+        </w:rPr>
+        <w:t xml:space="preserve">nflverse</w:t>
+      </w:r>
+      <w:r>
+        <w:t xml:space="preserve">:</w:t>
       </w:r>
     </w:p>
     <w:p>
@@ -2422,127 +2429,12 @@
           <w:b/>
           <w:bCs/>
         </w:rPr>
-        <w:t xml:space="preserve">Scored automatically:</w:t>
-      </w:r>
-      <w:r>
-        <w:t xml:space="preserve"> </w:t>
-      </w:r>
-      <w:r>
-        <w:t xml:space="preserve">offensive tackles, drops, red-zone turnovers, and</w:t>
-      </w:r>
-      <w:r>
-        <w:t xml:space="preserve"> </w:t>
-      </w:r>
-      <w:r>
-        <w:t xml:space="preserve">invalid roster spots (with injury auto-exemption).</w:t>
-      </w:r>
-    </w:p>
-    <w:p>
-      <w:pPr>
-        <w:pStyle w:val="Compact"/>
-        <w:numPr>
-          <w:ilvl w:val="0"/>
-          <w:numId w:val="1008"/>
-        </w:numPr>
-      </w:pPr>
-      <w:r>
-        <w:rPr>
-          <w:b/>
-          <w:bCs/>
-        </w:rPr>
-        <w:t xml:space="preserve">Flagged for review:</w:t>
-      </w:r>
-      <w:r>
-        <w:t xml:space="preserve"> </w:t>
-      </w:r>
-      <w:r>
-        <w:t xml:space="preserve">ejections, premature goal-line fumbles.</w:t>
-      </w:r>
-    </w:p>
-    <w:p>
-      <w:pPr>
-        <w:pStyle w:val="Compact"/>
-        <w:numPr>
-          <w:ilvl w:val="0"/>
-          <w:numId w:val="1008"/>
-        </w:numPr>
-      </w:pPr>
-      <w:r>
-        <w:rPr>
-          <w:b/>
-          <w:bCs/>
-        </w:rPr>
-        <w:t xml:space="preserve">Entirely manual:</w:t>
-      </w:r>
-      <w:r>
-        <w:t xml:space="preserve"> </w:t>
-      </w:r>
-      <w:r>
-        <w:t xml:space="preserve">arrests, league suspensions, cuts, the Pete Rose Award,</w:t>
-      </w:r>
-      <w:r>
-        <w:t xml:space="preserve"> </w:t>
-      </w:r>
-      <w:r>
-        <w:t xml:space="preserve">the Antonio Brown Rule, benchings, and chaotic-event votes — these require</w:t>
-      </w:r>
-      <w:r>
-        <w:t xml:space="preserve"> </w:t>
-      </w:r>
-      <w:r>
-        <w:t xml:space="preserve">news or judgment the data can't provide.</w:t>
-      </w:r>
-    </w:p>
-    <w:bookmarkEnd w:id="25"/>
-    <w:bookmarkStart w:id="29" w:name="data-sources--attribution"/>
-    <w:p>
-      <w:pPr>
-        <w:pStyle w:val="Heading3"/>
-      </w:pPr>
-      <w:r>
-        <w:t xml:space="preserve">Data sources &amp; attribution</w:t>
-      </w:r>
-    </w:p>
-    <w:p>
-      <w:pPr>
-        <w:pStyle w:val="FirstParagraph"/>
-      </w:pPr>
-      <w:r>
-        <w:t xml:space="preserve">All automated stats come from</w:t>
-      </w:r>
-      <w:r>
-        <w:t xml:space="preserve"> </w:t>
-      </w:r>
-      <w:r>
-        <w:rPr>
-          <w:b/>
-          <w:bCs/>
-        </w:rPr>
-        <w:t xml:space="preserve">nflverse</w:t>
-      </w:r>
-      <w:r>
-        <w:t xml:space="preserve">:</w:t>
-      </w:r>
-    </w:p>
-    <w:p>
-      <w:pPr>
-        <w:pStyle w:val="Compact"/>
-        <w:numPr>
-          <w:ilvl w:val="0"/>
-          <w:numId w:val="1009"/>
-        </w:numPr>
-      </w:pPr>
-      <w:r>
-        <w:rPr>
-          <w:b/>
-          <w:bCs/>
-        </w:rPr>
         <w:t xml:space="preserve">nflverse-data:</w:t>
       </w:r>
       <w:r>
         <w:t xml:space="preserve"> </w:t>
       </w:r>
-      <w:hyperlink r:id="rId26">
+      <w:hyperlink r:id="rId25">
         <w:r>
           <w:rPr>
             <w:rStyle w:val="Hyperlink"/>
@@ -2556,7 +2448,7 @@
         <w:pStyle w:val="Compact"/>
         <w:numPr>
           <w:ilvl w:val="0"/>
-          <w:numId w:val="1009"/>
+          <w:numId w:val="1008"/>
         </w:numPr>
       </w:pPr>
       <w:r>
@@ -2580,7 +2472,7 @@
       <w:r>
         <w:t xml:space="preserve"> </w:t>
       </w:r>
-      <w:hyperlink r:id="rId27">
+      <w:hyperlink r:id="rId26">
         <w:r>
           <w:rPr>
             <w:rStyle w:val="Hyperlink"/>
@@ -2594,7 +2486,7 @@
         <w:pStyle w:val="Compact"/>
         <w:numPr>
           <w:ilvl w:val="0"/>
-          <w:numId w:val="1009"/>
+          <w:numId w:val="1008"/>
         </w:numPr>
       </w:pPr>
       <w:r>
@@ -2651,7 +2543,7 @@
       <w:r>
         <w:t xml:space="preserve">(</w:t>
       </w:r>
-      <w:hyperlink r:id="rId28">
+      <w:hyperlink r:id="rId27">
         <w:r>
           <w:rPr>
             <w:rStyle w:val="Hyperlink"/>
@@ -2669,9 +2561,9 @@
         <w:t xml:space="preserve">within ~48 hours of a game, which is why Chaos scoring posts on Wednesdays.</w:t>
       </w:r>
     </w:p>
+    <w:bookmarkEnd w:id="28"/>
     <w:bookmarkEnd w:id="29"/>
     <w:bookmarkEnd w:id="30"/>
-    <w:bookmarkEnd w:id="31"/>
     <w:sectPr>
       <w:footnotePr>
         <w:numRestart w:val="eachSect"/>
@@ -3049,9 +2941,6 @@
     <w:abstractNumId w:val="991"/>
   </w:num>
   <w:num w:numId="1008">
-    <w:abstractNumId w:val="991"/>
-  </w:num>
-  <w:num w:numId="1009">
     <w:abstractNumId w:val="991"/>
   </w:num>
 </w:numbering>

</xml_diff>

<commit_message>
docs: document non-QB TD pass, taunting, and pre-snap penalty rules
</commit_message>
<xml_diff>
--- a/LEAGUE_RULES.docx
+++ b/LEAGUE_RULES.docx
@@ -512,6 +512,135 @@
                 <w:b/>
                 <w:bCs/>
               </w:rPr>
+              <w:t xml:space="preserve">Non-QB TD Pass</w:t>
+            </w:r>
+          </w:p>
+        </w:tc>
+        <w:tc>
+          <w:tcPr/>
+          <w:p>
+            <w:pPr>
+              <w:pStyle w:val="Compact"/>
+            </w:pPr>
+            <w:r>
+              <w:rPr>
+                <w:b/>
+                <w:bCs/>
+              </w:rPr>
+              <w:t xml:space="preserve">+20</w:t>
+            </w:r>
+          </w:p>
+        </w:tc>
+        <w:tc>
+          <w:tcPr/>
+          <w:p>
+            <w:pPr>
+              <w:pStyle w:val="Compact"/>
+            </w:pPr>
+            <w:r>
+              <w:t xml:space="preserve">A started non-QB (RB/WR/TE/FB) throws a touchdown pass (trick play).</w:t>
+            </w:r>
+          </w:p>
+        </w:tc>
+      </w:tr>
+      <w:tr>
+        <w:tc>
+          <w:tcPr/>
+          <w:p>
+            <w:pPr>
+              <w:pStyle w:val="Compact"/>
+            </w:pPr>
+            <w:r>
+              <w:rPr>
+                <w:b/>
+                <w:bCs/>
+              </w:rPr>
+              <w:t xml:space="preserve">Taunting / Unsportsmanlike</w:t>
+            </w:r>
+          </w:p>
+        </w:tc>
+        <w:tc>
+          <w:tcPr/>
+          <w:p>
+            <w:pPr>
+              <w:pStyle w:val="Compact"/>
+            </w:pPr>
+            <w:r>
+              <w:rPr>
+                <w:b/>
+                <w:bCs/>
+              </w:rPr>
+              <w:t xml:space="preserve">+15</w:t>
+            </w:r>
+          </w:p>
+        </w:tc>
+        <w:tc>
+          <w:tcPr/>
+          <w:p>
+            <w:pPr>
+              <w:pStyle w:val="Compact"/>
+            </w:pPr>
+            <w:r>
+              <w:t xml:space="preserve">A started player is flagged for taunting or unsportsmanlike conduct.</w:t>
+            </w:r>
+          </w:p>
+        </w:tc>
+      </w:tr>
+      <w:tr>
+        <w:tc>
+          <w:tcPr/>
+          <w:p>
+            <w:pPr>
+              <w:pStyle w:val="Compact"/>
+            </w:pPr>
+            <w:r>
+              <w:rPr>
+                <w:b/>
+                <w:bCs/>
+              </w:rPr>
+              <w:t xml:space="preserve">Pre-Snap Penalty</w:t>
+            </w:r>
+          </w:p>
+        </w:tc>
+        <w:tc>
+          <w:tcPr/>
+          <w:p>
+            <w:pPr>
+              <w:pStyle w:val="Compact"/>
+            </w:pPr>
+            <w:r>
+              <w:rPr>
+                <w:b/>
+                <w:bCs/>
+              </w:rPr>
+              <w:t xml:space="preserve">+5</w:t>
+            </w:r>
+          </w:p>
+        </w:tc>
+        <w:tc>
+          <w:tcPr/>
+          <w:p>
+            <w:pPr>
+              <w:pStyle w:val="Compact"/>
+            </w:pPr>
+            <w:r>
+              <w:t xml:space="preserve">A started player commits a pre-snap penalty (false start, delay of game, illegal formation/shift/motion).</w:t>
+            </w:r>
+          </w:p>
+        </w:tc>
+      </w:tr>
+      <w:tr>
+        <w:tc>
+          <w:tcPr/>
+          <w:p>
+            <w:pPr>
+              <w:pStyle w:val="Compact"/>
+            </w:pPr>
+            <w:r>
+              <w:rPr>
+                <w:b/>
+                <w:bCs/>
+              </w:rPr>
               <w:t xml:space="preserve">Invalid Roster Spot</w:t>
             </w:r>
           </w:p>
@@ -1835,7 +1964,7 @@
         <w:t xml:space="preserve"> </w:t>
       </w:r>
       <w:r>
-        <w:t xml:space="preserve">offensive tackles (+15), drops (+5), red-zone turnovers (+5 to everyone involved), invalid spots (−15, injuries auto-exempt).</w:t>
+        <w:t xml:space="preserve">offensive tackles (+15), drops (+5), red-zone turnovers (+5 to everyone involved), non-QB TD passes (+20), taunting/unsportsmanlike (+15), pre-snap penalties (+5), invalid spots (−15, injuries auto-exempt).</w:t>
       </w:r>
     </w:p>
     <w:p>
@@ -2320,13 +2449,19 @@
         <w:t xml:space="preserve"> </w:t>
       </w:r>
       <w:r>
-        <w:t xml:space="preserve">offensive tackles, drops, red-zone turnovers, and</w:t>
-      </w:r>
-      <w:r>
-        <w:t xml:space="preserve"> </w:t>
-      </w:r>
-      <w:r>
-        <w:t xml:space="preserve">invalid roster spots (with injury auto-exemption).</w:t>
+        <w:t xml:space="preserve">offensive tackles, drops, red-zone turnovers, non-QB</w:t>
+      </w:r>
+      <w:r>
+        <w:t xml:space="preserve"> </w:t>
+      </w:r>
+      <w:r>
+        <w:t xml:space="preserve">TD passes, taunting/unsportsmanlike and pre-snap penalties, and invalid roster</w:t>
+      </w:r>
+      <w:r>
+        <w:t xml:space="preserve"> </w:t>
+      </w:r>
+      <w:r>
+        <w:t xml:space="preserve">spots (with injury auto-exemption).</w:t>
       </w:r>
     </w:p>
     <w:p>

</xml_diff>

<commit_message>
Only exempt in-game injuries from invalid roster spot
A player ruled out before kickoff is known information, so starting him is an
invalid roster spot. Drop the pre-game injury-report auto-exemption (Out/
Doubtful); only in-game injuries and manual --exempt-invalid exempt now.
</commit_message>
<xml_diff>
--- a/LEAGUE_RULES.docx
+++ b/LEAGUE_RULES.docx
@@ -735,35 +735,53 @@
           <w:b/>
           <w:bCs/>
         </w:rPr>
-        <w:t xml:space="preserve">Injured players are auto-exempt.</w:t>
-      </w:r>
-      <w:r>
-        <w:t xml:space="preserve"> </w:t>
-      </w:r>
-      <w:r>
-        <w:t xml:space="preserve">Anyone ruled</w:t>
-      </w:r>
-      <w:r>
-        <w:t xml:space="preserve"> </w:t>
-      </w:r>
+        <w:t xml:space="preserve">Players hurt during the game are auto-exempt.</w:t>
+      </w:r>
+      <w:r>
+        <w:t xml:space="preserve"> </w:t>
+      </w:r>
+      <w:r>
+        <w:t xml:space="preserve">If a player is injured</w:t>
+      </w:r>
+      <w:r>
+        <w:t xml:space="preserve"> </w:t>
+      </w:r>
+      <w:r>
+        <w:t xml:space="preserve">in-game (per the play-by-play), the wasted spot isn't his manager's fault.</w:t>
+      </w:r>
+    </w:p>
+    <w:p>
+      <w:pPr>
+        <w:pStyle w:val="Compact"/>
+        <w:numPr>
+          <w:ilvl w:val="0"/>
+          <w:numId w:val="1003"/>
+        </w:numPr>
+      </w:pPr>
       <w:r>
         <w:rPr>
           <w:b/>
           <w:bCs/>
         </w:rPr>
-        <w:t xml:space="preserve">Out or Doubtful</w:t>
-      </w:r>
-      <w:r>
-        <w:t xml:space="preserve"> </w:t>
-      </w:r>
-      <w:r>
-        <w:t xml:space="preserve">on the</w:t>
-      </w:r>
-      <w:r>
-        <w:t xml:space="preserve"> </w:t>
-      </w:r>
-      <w:r>
-        <w:t xml:space="preserve">week's injury report (or hurt in-game) is excluded automatically — no penalty.</w:t>
+        <w:t xml:space="preserve">A player ruled out before kickoff is NOT exempt.</w:t>
+      </w:r>
+      <w:r>
+        <w:t xml:space="preserve"> </w:t>
+      </w:r>
+      <w:r>
+        <w:t xml:space="preserve">That was known</w:t>
+      </w:r>
+      <w:r>
+        <w:t xml:space="preserve"> </w:t>
+      </w:r>
+      <w:r>
+        <w:t xml:space="preserve">information, so starting an inactive player is exactly the invalid roster</w:t>
+      </w:r>
+      <w:r>
+        <w:t xml:space="preserve"> </w:t>
+      </w:r>
+      <w:r>
+        <w:t xml:space="preserve">spot this rule penalizes.</w:t>
       </w:r>
     </w:p>
     <w:p>
@@ -1964,7 +1982,7 @@
         <w:t xml:space="preserve"> </w:t>
       </w:r>
       <w:r>
-        <w:t xml:space="preserve">offensive tackles (+15), drops (+5), red-zone turnovers (+5 to everyone involved), non-QB TD passes (+20), taunting/unsportsmanlike (+15), pre-snap penalties (+5), invalid spots (−15, injuries auto-exempt).</w:t>
+        <w:t xml:space="preserve">offensive tackles (+15), drops (+5), red-zone turnovers (+5 to everyone involved), non-QB TD passes (+20), taunting/unsportsmanlike (+15), pre-snap penalties (+5), invalid spots (−15, in-game injuries auto-exempt).</w:t>
       </w:r>
     </w:p>
     <w:p>

</xml_diff>

<commit_message>
docs: add penalty-negates-TD (+10) and one-point safety (+1000) rules
</commit_message>
<xml_diff>
--- a/LEAGUE_RULES.docx
+++ b/LEAGUE_RULES.docx
@@ -641,6 +641,49 @@
                 <w:b/>
                 <w:bCs/>
               </w:rPr>
+              <w:t xml:space="preserve">Penalty Negates a TD</w:t>
+            </w:r>
+          </w:p>
+        </w:tc>
+        <w:tc>
+          <w:tcPr/>
+          <w:p>
+            <w:pPr>
+              <w:pStyle w:val="Compact"/>
+            </w:pPr>
+            <w:r>
+              <w:rPr>
+                <w:b/>
+                <w:bCs/>
+              </w:rPr>
+              <w:t xml:space="preserve">+10</w:t>
+            </w:r>
+          </w:p>
+        </w:tc>
+        <w:tc>
+          <w:tcPr/>
+          <w:p>
+            <w:pPr>
+              <w:pStyle w:val="Compact"/>
+            </w:pPr>
+            <w:r>
+              <w:t xml:space="preserve">A started player's penalty (any type) wipes out a touchdown for their own team. Stacks on top of the taunting/pre-snap bonus.</w:t>
+            </w:r>
+          </w:p>
+        </w:tc>
+      </w:tr>
+      <w:tr>
+        <w:tc>
+          <w:tcPr/>
+          <w:p>
+            <w:pPr>
+              <w:pStyle w:val="Compact"/>
+            </w:pPr>
+            <w:r>
+              <w:rPr>
+                <w:b/>
+                <w:bCs/>
+              </w:rPr>
               <w:t xml:space="preserve">Invalid Roster Spot</w:t>
             </w:r>
           </w:p>
@@ -1111,6 +1154,49 @@
           </w:p>
         </w:tc>
       </w:tr>
+      <w:tr>
+        <w:tc>
+          <w:tcPr/>
+          <w:p>
+            <w:pPr>
+              <w:pStyle w:val="Compact"/>
+            </w:pPr>
+            <w:r>
+              <w:rPr>
+                <w:b/>
+                <w:bCs/>
+              </w:rPr>
+              <w:t xml:space="preserve">One-Point Safety</w:t>
+            </w:r>
+          </w:p>
+        </w:tc>
+        <w:tc>
+          <w:tcPr/>
+          <w:p>
+            <w:pPr>
+              <w:pStyle w:val="Compact"/>
+            </w:pPr>
+            <w:r>
+              <w:rPr>
+                <w:b/>
+                <w:bCs/>
+              </w:rPr>
+              <w:t xml:space="preserve">+1000</w:t>
+            </w:r>
+          </w:p>
+        </w:tc>
+        <w:tc>
+          <w:tcPr/>
+          <w:p>
+            <w:pPr>
+              <w:pStyle w:val="Compact"/>
+            </w:pPr>
+            <w:r>
+              <w:t xml:space="preserve">A safety scored on a conversion attempt (extra point or two-point try). Has never happened in NFL history, but it's possible. The script flags it; the commissioner awards it to the scoring defense.</w:t>
+            </w:r>
+          </w:p>
+        </w:tc>
+      </w:tr>
     </w:tbl>
     <w:p>
       <w:r>
@@ -1982,7 +2068,7 @@
         <w:t xml:space="preserve"> </w:t>
       </w:r>
       <w:r>
-        <w:t xml:space="preserve">offensive tackles (+15), drops (+5), red-zone turnovers (+5 to everyone involved), non-QB TD passes (+20), taunting/unsportsmanlike (+15), pre-snap penalties (+5), invalid spots (−15, in-game injuries auto-exempt).</w:t>
+        <w:t xml:space="preserve">offensive tackles (+15), drops (+5), red-zone turnovers (+5 to everyone involved), non-QB TD passes (+20), taunting/unsportsmanlike (+15), pre-snap penalties (+5), penalties that negate a TD (+10), invalid spots (−15, in-game injuries auto-exempt).</w:t>
       </w:r>
     </w:p>
     <w:p>
@@ -2004,7 +2090,7 @@
         <w:t xml:space="preserve"> </w:t>
       </w:r>
       <w:r>
-        <w:t xml:space="preserve">ejections (+20), goal-line celebration fumbles (+35).</w:t>
+        <w:t xml:space="preserve">ejections (+20), goal-line celebration fumbles (+35), one-point safeties (+1000).</w:t>
       </w:r>
     </w:p>
     <w:p>
@@ -2473,13 +2559,13 @@
         <w:t xml:space="preserve"> </w:t>
       </w:r>
       <w:r>
-        <w:t xml:space="preserve">TD passes, taunting/unsportsmanlike and pre-snap penalties, and invalid roster</w:t>
-      </w:r>
-      <w:r>
-        <w:t xml:space="preserve"> </w:t>
-      </w:r>
-      <w:r>
-        <w:t xml:space="preserve">spots (with injury auto-exemption).</w:t>
+        <w:t xml:space="preserve">TD passes, taunting/unsportsmanlike and pre-snap penalties, penalties that</w:t>
+      </w:r>
+      <w:r>
+        <w:t xml:space="preserve"> </w:t>
+      </w:r>
+      <w:r>
+        <w:t xml:space="preserve">negate a touchdown, and invalid roster spots (with injury auto-exemption).</w:t>
       </w:r>
     </w:p>
     <w:p>
@@ -2501,7 +2587,13 @@
         <w:t xml:space="preserve"> </w:t>
       </w:r>
       <w:r>
-        <w:t xml:space="preserve">ejections, premature goal-line fumbles.</w:t>
+        <w:t xml:space="preserve">ejections, premature goal-line fumbles, one-point</w:t>
+      </w:r>
+      <w:r>
+        <w:t xml:space="preserve"> </w:t>
+      </w:r>
+      <w:r>
+        <w:t xml:space="preserve">safeties.</w:t>
       </w:r>
     </w:p>
     <w:p>

</xml_diff>